<commit_message>
ert: empirical verification + Philosophy Engineering hook
Synthetic: numerically confirm the schism theorem (Prop 2) — stiffness matches
4*delta*cot(delta) to 4 dp, zero at pi/2; Frechet reference bifurcates only under
positive curvature. Real data: first probe of Falsifier 5 on AITA (n=2922) is an
INCONCLUSIVE NULL — no contestation<->bimodality relation, robust across bge-small
and bge-base, but underpowered (moral-axis AUC ~0.60, 4.5:1 verdict skew); reported
honestly, not as falsification. Adds experiments/ert/ (scripts + RESULTS.md), a
Philosophy Engineering 'note on method' in paper sec.1, and a sec.8 preliminary-results
note; rebuilt tex/docx/pdf (13pp, clean).

Co-Authored-By: Claude Opus 4.8 (1M context) <noreply@anthropic.com>
</commit_message>
<xml_diff>
--- a/docs/papers/foundations/endogenous_reference_theory.docx
+++ b/docs/papers/foundations/endogenous_reference_theory.docx
@@ -398,6 +398,53 @@
       </w:r>
       <w:r>
         <w:t xml:space="preserve">, and that the model for such a thing is already familiar to any electrical engineer.</w:t>
+      </w:r>
+    </w:p>
+    <w:p>
+      <w:pPr>
+        <w:pStyle w:val="BodyText"/>
+      </w:pPr>
+      <w:r>
+        <w:rPr>
+          <w:b/>
+          <w:bCs/>
+        </w:rPr>
+        <w:t xml:space="preserve">A note on method.</w:t>
+      </w:r>
+      <w:r>
+        <w:t xml:space="preserve"> </w:t>
+      </w:r>
+      <w:r>
+        <w:t xml:space="preserve">ERT is offered in the spirit of</w:t>
+      </w:r>
+      <w:r>
+        <w:t xml:space="preserve"> </w:t>
+      </w:r>
+      <w:r>
+        <w:rPr>
+          <w:i/>
+          <w:iCs/>
+        </w:rPr>
+        <w:t xml:space="preserve">Philosophy Engineering</w:t>
+      </w:r>
+      <w:r>
+        <w:t xml:space="preserve">: the discipline of stating a philosophical claim formally enough that it can be computed, made to predict, and broken. Where traditional metaethics argues toward a position and rests, ERT is built to be</w:t>
+      </w:r>
+      <w:r>
+        <w:t xml:space="preserve"> </w:t>
+      </w:r>
+      <w:r>
+        <w:rPr>
+          <w:i/>
+          <w:iCs/>
+        </w:rPr>
+        <w:t xml:space="preserve">operated</w:t>
+      </w:r>
+      <w:r>
+        <w:t xml:space="preserve"> </w:t>
+      </w:r>
+      <w:r>
+        <w:t xml:space="preserve">— it gives the moral reference a closed-form construction (the load-weighted Fréchet mean, §3), derives consequences that could have come out otherwise (the conservation law, §5.2; the schism threshold, §5.6), exposes a falsification battery (§8), and ships with a reproducible computational artifact that both verifies the formal results numerically and applies them to real moral-judgment data — continuing the program of the Geometric Ethics framework [Bond 2026]. A metaethics that cannot be wrong in public is, on this view, not yet finished; the rest of this paper is an attempt to make ERT wrong and a report of where it survives.</w:t>
       </w:r>
     </w:p>
     <w:bookmarkEnd w:id="10"/>
@@ -9222,6 +9269,118 @@
       </w:pPr>
       <w:r>
         <w:t xml:space="preserve">These are demanding and, with population-scale moral measurement, approachable. Tests 5–6 are the sharpest: they target the schism result (§5.6–5.7), which has no scalar or flat-space analogue, so a clean negative there would falsify ERT’s distinctive content specifically — not merely some shared feature of structural metaethics.</w:t>
+      </w:r>
+    </w:p>
+    <w:p>
+      <w:pPr>
+        <w:pStyle w:val="BodyText"/>
+      </w:pPr>
+      <w:r>
+        <w:rPr>
+          <w:b/>
+          <w:bCs/>
+        </w:rPr>
+        <w:t xml:space="preserve">Preliminary results.</w:t>
+      </w:r>
+      <w:r>
+        <w:t xml:space="preserve"> </w:t>
+      </w:r>
+      <w:r>
+        <w:t xml:space="preserve">The accompanying artifact exercises these tests rather than leaving them as promissory notes. The synthetic confirmation is clean: the schism stiffness</w:t>
+      </w:r>
+      <w:r>
+        <w:t xml:space="preserve"> </w:t>
+      </w:r>
+      <m:oMath>
+        <m:sSub>
+          <m:e>
+            <m:r>
+              <m:t>h</m:t>
+            </m:r>
+          </m:e>
+          <m:sub>
+            <m:r>
+              <m:t>κ</m:t>
+            </m:r>
+          </m:sub>
+        </m:sSub>
+        <m:r>
+          <m:rPr>
+            <m:sty m:val="p"/>
+          </m:rPr>
+          <m:t>(</m:t>
+        </m:r>
+        <m:r>
+          <m:t>δ</m:t>
+        </m:r>
+        <m:r>
+          <m:rPr>
+            <m:sty m:val="p"/>
+          </m:rPr>
+          <m:t>)</m:t>
+        </m:r>
+      </m:oMath>
+      <w:r>
+        <w:t xml:space="preserve"> </w:t>
+      </w:r>
+      <w:r>
+        <w:t xml:space="preserve">matches its closed form to four decimals and vanishes at</w:t>
+      </w:r>
+      <w:r>
+        <w:t xml:space="preserve"> </w:t>
+      </w:r>
+      <m:oMath>
+        <m:rad>
+          <m:radPr>
+            <m:degHide m:val="on"/>
+          </m:radPr>
+          <m:deg/>
+          <m:e>
+            <m:r>
+              <m:t>κ</m:t>
+            </m:r>
+          </m:e>
+        </m:rad>
+        <m:r>
+          <m:t> </m:t>
+        </m:r>
+        <m:r>
+          <m:t>δ</m:t>
+        </m:r>
+        <m:r>
+          <m:rPr>
+            <m:sty m:val="p"/>
+          </m:rPr>
+          <m:t>=</m:t>
+        </m:r>
+        <m:r>
+          <m:t>π</m:t>
+        </m:r>
+        <m:r>
+          <m:rPr>
+            <m:sty m:val="p"/>
+          </m:rPr>
+          <m:t>/</m:t>
+        </m:r>
+        <m:r>
+          <m:t>2</m:t>
+        </m:r>
+      </m:oMath>
+      <w:r>
+        <w:t xml:space="preserve">, and the Fréchet reference bifurcates only under positive curvature — Proposition 2 holds numerically. A first probe of Test 5 on real moral judgments (≈2,900 labelled AITA dilemmas) was, by contrast,</w:t>
+      </w:r>
+      <w:r>
+        <w:t xml:space="preserve"> </w:t>
+      </w:r>
+      <w:r>
+        <w:rPr>
+          <w:b/>
+          <w:bCs/>
+        </w:rPr>
+        <w:t xml:space="preserve">inconclusive</w:t>
+      </w:r>
+      <w:r>
+        <w:t xml:space="preserve">: contestation showed no relation to bimodality of the recovered moral-position axis (robust across two encoders), but the test is underpowered — the moral axis was only weakly recoverable (AUC ≈ 0.60) on a heavily verdict-skewed corpus, and the curvature half of Test 5 was not exercised. We report this as a null the instrument cannot yet turn into a falsification; a decisive test needs a polarized, vote-margin corpus and a direct curvature estimate. In the Philosophy Engineering spirit, the failure is part of the record, not hidden.</w:t>
       </w:r>
     </w:p>
     <w:bookmarkEnd w:id="28"/>

</xml_diff>